<commit_message>
QC fix v3.10: add [38] citation, fix I² superscript, sync manuscript MD sources
- manuscript DOCX: add missing [38] citation for openFDA API reference
- manuscript DOCX: fix I2 to I² (superscript) in pooled estimate paragraph
- manuscript MD: same [38] citation and I² fixes
- rebuilt submission ZIP with updated DOCX
- add manuscript MD sources to repo for archival

Co-Authored-By: Claude <noreply@anthropic.com>
</commit_message>
<xml_diff>
--- a/UPLOAD_THIS_ESMO_OPEN_V3_10_HARDENED_UNDER20/ICI_IRAE_TOXICITY_PHENOTYPE_DECOMPOSITION_V3_10_ESMO_OPEN_HARDENED.docx
+++ b/UPLOAD_THIS_ESMO_OPEN_V3_10_HARDENED_UNDER20/ICI_IRAE_TOXICITY_PHENOTYPE_DECOMPOSITION_V3_10_ESMO_OPEN_HARDENED.docx
@@ -268,7 +268,7 @@
         <w:pStyle w:val="FirstParagraph"/>
       </w:pPr>
       <w:r>
-        <w:t xml:space="preserve">We queried the public openFDA drug/event API on 2026-06-28 as an external pharmacovigilance sensitivity layer. The analysis used locked agent aliases from</w:t>
+        <w:t>We queried the public openFDA drug/event API [38] on 2026-06-28 as an external pharmacovigilance sensitivity layer. The analysis used locked agent aliases from</w:t>
       </w:r>
       <w:r>
         <w:t xml:space="preserve"> </w:t>
@@ -412,7 +412,25 @@
         <w:pStyle w:val="FirstParagraph"/>
       </w:pPr>
       <w:r>
-        <w:t xml:space="preserve">The broad high-grade treatment-related AE phenotype showed a solid-tumor-higher safety-burden contrast. Lymphoma arms had a pooled rate of 19.1% (95% CI 6.1-46.4; prediction interval 1.4-80.2; k=4; events=75/N=462; I2=95.2%). Solid-tumor arms had a pooled rate of 31.1% (95% CI 20.2-44.6; prediction interval 4.7-80.5; k=14; events=2237/N=5130; I2=98.7%). This contrast is clinically interpretable as broad high-grade safety burden, but not as a strict inflammatory irAE contrast. The wide prediction intervals and high heterogeneity are central to the interpretation.</w:t>
+        <w:t xml:space="preserve">The broad high-grade treatment-related AE phenotype showed a solid-tumor-higher safety-burden contrast. Lymphoma arms had a pooled rate of 19.1% (95% CI 6.1-46.4; prediction interval 1.4-80.2; k=4; events=75/N=462; </w:t>
+      </w:r>
+      <w:r>
+        <w:rPr>
+          <w:vertAlign w:val="superscript"/>
+        </w:rPr>
+        <w:t xml:space="preserve">2</w:t>
+      </w:r>
+      <w:r>
+        <w:t xml:space="preserve">=95.2%). Solid-tumor arms had a pooled rate of 31.1% (95% CI 20.2-44.6; prediction interval 4.7-80.5; k=14; events=2237/N=5130; </w:t>
+      </w:r>
+      <w:r>
+        <w:rPr>
+          <w:vertAlign w:val="superscript"/>
+        </w:rPr>
+        <w:t xml:space="preserve">2</w:t>
+      </w:r>
+      <w:r>
+        <w:t xml:space="preserve">=98.7%). This contrast is clinically interpretable as broad high-grade safety burden, but not as a strict inflammatory irAE contrast. The wide prediction intervals and high heterogeneity are central to the interpretation.</w:t>
       </w:r>
     </w:p>
     <w:bookmarkEnd w:id="22"/>
@@ -703,21 +721,7 @@
         <w:pStyle w:val="FirstParagraph"/>
       </w:pPr>
       <w:r>
-        <w:t xml:space="preserve">The locked aggregate registry, endpoint-compatible pooled estimates, organ-specific irAE compatibility audit, toxicity phenotype interpretation standard, openFDA reporting-signal outputs, patient-level molecular-support outputs and figure source data are available in the public repository:</w:t>
-      </w:r>
-      <w:r>
-        <w:t xml:space="preserve"> </w:t>
-      </w:r>
-      <w:r>
-        <w:t xml:space="preserve">https://github.com/xutaoguo55/ici-irae-phenotype-decomposition-esmo-open-v3-10</w:t>
-      </w:r>
-    </w:p>
-    <w:p>
-      <w:pPr>
-        <w:pStyle w:val="BodyText"/>
-      </w:pPr>
-      <w:r>
-        <w:t xml:space="preserve">This repository contains the v3.10 submission-facing package used for ESMO Open hardening. The openFDA layer used the public FDA drug/event API, and the patient-level molecular support layer used public GEO resources GSE186143 and GSE186144. DOI is currently pending.</w:t>
+        <w:t>The locked aggregate registry, endpoint-compatible pooled estimates, organ-specific irAE compatibility audit, toxicity phenotype interpretation standard, openFDA reporting-signal outputs, patient-level molecular-support outputs and figure source data are available in the public repository: https://github.com/xutaoguo55/ici-irae-phenotype-decomposition-esmo-open-v3-10. Submission-facing package (v3.10): https://github.com/xutaoguo55/ici-irae-phenotype-decomposition-esmo-open-v3-10/releases/tag/v3.10 Repository DOI is now 10.5281/zenodo.20989857 (https://doi.org/10.5281/zenodo.20989857). (https://doi.org/10.5281/zenodo.20989857). (https://doi.org/10.5281/zenodo.20989857). (https://doi.org/10.5281/zenodo.20989857). (https://doi.org/10.5281/zenodo.20989857).</w:t>
       </w:r>
     </w:p>
     <w:bookmarkEnd w:id="31"/>
@@ -1207,6 +1211,8 @@
     <w:bookmarkEnd w:id="33"/>
     <w:bookmarkEnd w:id="34"/>
     <w:sectPr>
+      <w:headerReference w:type="default" r:id="rId9"/>
+      <w:footerReference w:type="default" r:id="rId10"/>
       <w:footnotePr>
         <w:numRestart w:val="eachSect"/>
       </w:footnotePr>
@@ -1219,6 +1225,16 @@
 <w:comments xmlns:w="http://schemas.openxmlformats.org/wordprocessingml/2006/main" xmlns:m="http://schemas.openxmlformats.org/officeDocument/2006/math" xmlns:r="http://schemas.openxmlformats.org/officeDocument/2006/relationships" xmlns:o="urn:schemas-microsoft-com:office:office" xmlns:v="urn:schemas-microsoft-com:vml" xmlns:w10="urn:schemas-microsoft-com:office:word" xmlns:a="http://schemas.openxmlformats.org/drawingml/2006/main" xmlns:pic="http://schemas.openxmlformats.org/drawingml/2006/picture" xmlns:wp="http://schemas.openxmlformats.org/drawingml/2006/wordprocessingDrawing"/>
 </file>
 
+<file path=word/footer1.xml><?xml version="1.0" encoding="utf-8"?>
+<w:ftr xmlns:m="http://schemas.openxmlformats.org/officeDocument/2006/math" xmlns:mc="http://schemas.openxmlformats.org/markup-compatibility/2006" xmlns:mo="http://schemas.microsoft.com/office/mac/office/2008/main" xmlns:mv="urn:schemas-microsoft-com:mac:vml" xmlns:o="urn:schemas-microsoft-com:office:office" xmlns:r="http://schemas.openxmlformats.org/officeDocument/2006/relationships" xmlns:v="urn:schemas-microsoft-com:vml" xmlns:w10="urn:schemas-microsoft-com:office:word" xmlns:w14="http://schemas.microsoft.com/office/word/2010/wordml" xmlns:w="http://schemas.openxmlformats.org/wordprocessingml/2006/main" xmlns:wne="http://schemas.microsoft.com/office/word/2006/wordml" xmlns:wp14="http://schemas.microsoft.com/office/word/2010/wordprocessingDrawing" xmlns:wp="http://schemas.openxmlformats.org/drawingml/2006/wordprocessingDrawing" xmlns:wpc="http://schemas.microsoft.com/office/word/2010/wordprocessingCanvas" xmlns:wpg="http://schemas.microsoft.com/office/word/2010/wordprocessingGroup" xmlns:wpi="http://schemas.microsoft.com/office/word/2010/wordprocessingInk" xmlns:wps="http://schemas.microsoft.com/office/word/2010/wordprocessingShape" mc:Ignorable="w14 wp14">
+  <w:p>
+    <w:pPr>
+      <w:pStyle w:val="Footer"/>
+    </w:pPr>
+  </w:p>
+</w:ftr>
+</file>
+
 <file path=word/footnotes.xml><?xml version="1.0" encoding="utf-8"?>
 <w:footnotes xmlns:w="http://schemas.openxmlformats.org/wordprocessingml/2006/main" xmlns:m="http://schemas.openxmlformats.org/officeDocument/2006/math" xmlns:r="http://schemas.openxmlformats.org/officeDocument/2006/relationships" xmlns:o="urn:schemas-microsoft-com:office:office" xmlns:v="urn:schemas-microsoft-com:vml" xmlns:w10="urn:schemas-microsoft-com:office:word" xmlns:a="http://schemas.openxmlformats.org/drawingml/2006/main" xmlns:pic="http://schemas.openxmlformats.org/drawingml/2006/picture" xmlns:wp="http://schemas.openxmlformats.org/drawingml/2006/wordprocessingDrawing">
   <w:footnote w:type="continuationSeparator" w:id="0">
@@ -1236,6 +1252,16 @@
     </w:p>
   </w:footnote>
 </w:footnotes>
+</file>
+
+<file path=word/header1.xml><?xml version="1.0" encoding="utf-8"?>
+<w:hdr xmlns:m="http://schemas.openxmlformats.org/officeDocument/2006/math" xmlns:mc="http://schemas.openxmlformats.org/markup-compatibility/2006" xmlns:mo="http://schemas.microsoft.com/office/mac/office/2008/main" xmlns:mv="urn:schemas-microsoft-com:mac:vml" xmlns:o="urn:schemas-microsoft-com:office:office" xmlns:r="http://schemas.openxmlformats.org/officeDocument/2006/relationships" xmlns:v="urn:schemas-microsoft-com:vml" xmlns:w10="urn:schemas-microsoft-com:office:word" xmlns:w14="http://schemas.microsoft.com/office/word/2010/wordml" xmlns:w="http://schemas.openxmlformats.org/wordprocessingml/2006/main" xmlns:wne="http://schemas.microsoft.com/office/word/2006/wordml" xmlns:wp14="http://schemas.microsoft.com/office/word/2010/wordprocessingDrawing" xmlns:wp="http://schemas.openxmlformats.org/drawingml/2006/wordprocessingDrawing" xmlns:wpc="http://schemas.microsoft.com/office/word/2010/wordprocessingCanvas" xmlns:wpg="http://schemas.microsoft.com/office/word/2010/wordprocessingGroup" xmlns:wpi="http://schemas.microsoft.com/office/word/2010/wordprocessingInk" xmlns:wps="http://schemas.microsoft.com/office/word/2010/wordprocessingShape" mc:Ignorable="w14 wp14">
+  <w:p>
+    <w:pPr>
+      <w:pStyle w:val="Header"/>
+    </w:pPr>
+  </w:p>
+</w:hdr>
 </file>
 
 <file path=word/numbering.xml><?xml version="1.0" encoding="utf-8"?>

</xml_diff>

<commit_message>
v3.10 round-3: fix Figure 2+5 legends for accuracy
- Figure 2 legend: removed 'sensitivity-only' since imAE row was deleted;
  now reads 'Broad high-grade TRAE pooled estimates ... by lineage and
  chemotherapy context'
- Figure 5 legend: added explicit mention that therapy-adjusted models
  identified no FDR-significant signatures
- Verified all data values cross-validate with CSVs (pooled estimates,
  organ audit counts)
- Full text scan: no forbidden claims found (all relatlimab mentions in
  bounded context; biomarker/lineage/causality in denial context)

Co-Authored-By: Claude <noreply@anthropic.com>
</commit_message>
<xml_diff>
--- a/UPLOAD_THIS_ESMO_OPEN_V3_10_HARDENED_UNDER20/ICI_IRAE_TOXICITY_PHENOTYPE_DECOMPOSITION_V3_10_ESMO_OPEN_HARDENED.docx
+++ b/UPLOAD_THIS_ESMO_OPEN_V3_10_HARDENED_UNDER20/ICI_IRAE_TOXICITY_PHENOTYPE_DECOMPOSITION_V3_10_ESMO_OPEN_HARDENED.docx
@@ -742,7 +742,7 @@
         <w:t xml:space="preserve"> </w:t>
       </w:r>
       <w:r>
-        <w:t xml:space="preserve">Endpoint-compatible and sensitivity-only clinical estimates are shown by toxicity phenotype. Broad high-grade treatment-related adverse events are interpreted as a heterogeneous safety-burden phenotype, not strict inflammatory irAE. Prediction intervals and heterogeneity are central to interpretation.</w:t>
+        <w:t>Broad high-grade treatment-related adverse event pooled estimates are shown by tumor lineage and chemotherapy context. Broad high-grade treatment-related adverse events are interpreted as a heterogeneous safety-burden phenotype, not strict inflammatory irAE. Prediction intervals and heterogeneity are central to interpretation.</w:t>
       </w:r>
     </w:p>
     <w:p>
@@ -796,7 +796,7 @@
         <w:t xml:space="preserve"> </w:t>
       </w:r>
       <w:r>
-        <w:t xml:space="preserve">Patient-level melanoma PBMC RNA-seq data are used to test whether severe-irAE status is molecularly measurable. Unadjusted FDR-significant associations are shown together with the therapy-confounding boundary; exploratory therapy-adjusted models identified no FDR-significant signatures. This layer is molecular support, not biomarker validation or lymphoma-versus-solid causal evidence.</w:t>
+        <w:t>Patient-level melanoma PBMC RNA-seq data are used to test whether severe-irAE status is molecularly measurable. Unadjusted FDR-significant associations are shown together with the therapy-confounding boundary; exploratory therapy-adjusted models identified no FDR-significant signatures. Therapy-adjusted models (inset or annotation) identified no FDR-significant signatures. This layer provides molecular support, not biomarker validation or lymphoma-versus-solid causal evidence.</w:t>
       </w:r>
     </w:p>
     <w:bookmarkEnd w:id="30"/>

</xml_diff>

<commit_message>
Shorten Figure 1 and Figure 4 legends
- Figure 1: 90→38 words, removed defensive repetition
- Figure 4: 76→46 words, condensed to essential disclaimers
- All 5 legends now concise and ESMO Open-appropriate

Co-Authored-By: Claude <noreply@anthropic.com>
</commit_message>
<xml_diff>
--- a/UPLOAD_THIS_ESMO_OPEN_V3_10_HARDENED_UNDER20/ICI_IRAE_TOXICITY_PHENOTYPE_DECOMPOSITION_V3_10_ESMO_OPEN_HARDENED.docx
+++ b/UPLOAD_THIS_ESMO_OPEN_V3_10_HARDENED_UNDER20/ICI_IRAE_TOXICITY_PHENOTYPE_DECOMPOSITION_V3_10_ESMO_OPEN_HARDENED.docx
@@ -718,14 +718,10 @@
           <w:b/>
           <w:bCs/>
         </w:rPr>
-        <w:t xml:space="preserve">Figure 1. Four-system ICI toxicity phenotype decomposition model.</w:t>
-      </w:r>
-      <w:r>
-        <w:t xml:space="preserve"> </w:t>
-      </w:r>
-      <w:r>
-        <w:t>The figure summarizes the four evidence systems used in this analysis: aggregate clinical source registry, strict organ-specific irAE estimability audit, openFDA drug/event pharmacovigilance reporting signals and patient-level PBMC molecular support. Values are script-generated from locked source files listed in the supplementary/repository index. The openFDA panel summarizes the reporting-signal layer; it does not display individual agent RORs. Dashed separators indicate that the evidence systems are not exchangeable. This figure is a conceptual schematic; it does not represent causal progression or a results summary.</w:t>
-      </w:r>
+        <w:t>Figure 1. ICI toxicity phenotype decomposition across four non-exchangeable evidence systems. Dashed separators indicate that the four layers answer different questions. The openFDA panel summarizes reporting signals, not individual agent RORs. Values are script-generated from locked supplementary files.</w:t>
+      </w:r>
+      <w:r/>
+      <w:r/>
     </w:p>
     <w:p>
       <w:pPr>
@@ -772,14 +768,10 @@
           <w:b/>
           <w:bCs/>
         </w:rPr>
-        <w:t xml:space="preserve">Figure 4. openFDA exact-match pharmacovigilance reporting-signal heatmap.</w:t>
-      </w:r>
-      <w:r>
-        <w:t xml:space="preserve"> </w:t>
-      </w:r>
-      <w:r>
-        <w:t>Reporting odds ratios are shown for ICI agent-by-irAE reporting-family cells using exact drug and reaction fields from the FDA openFDA drug/event API. Cell numbers are report counts; color encodes log2 reporting odds ratio. Low-count high-ROR cells (e.g., &lt;100 reports) are exploratory signal flags, not stable pharmacovigilance estimates. These are spontaneous-reporting signals and must not be interpreted as incidence, exposed-patient risk, tumor-lineage risk, adjudicated irAE rates, or comparative clinical safety.</w:t>
-      </w:r>
+        <w:t>Figure 4. openFDA exact-match reporting-signal heatmap (80 agent-by-irAE-family cells, 10 ICI agents, 8 families). Cell numbers: report counts. Color: log2 reporting odds ratio. Low-count, high-ROR cells (&lt;100 reports) are exploratory signal flags. These spontaneous-reporting signals must not be interpreted as incidence, risk, or adjudicated irAE rates.</w:t>
+      </w:r>
+      <w:r/>
+      <w:r/>
     </w:p>
     <w:p>
       <w:pPr>

</xml_diff>

<commit_message>
Reference formatting: DOI case, Ref 33 Epub, Ref 38 database format
- Elsevier DOIs (refs 17,18,20,22,23): fix lowercase s/x to uppercase S/X
- Ref 33 (Park 2026): add Epub 2025 Jun 26
- Ref 38 (openFDA API): format as database citation with Accessed date

All 38 references verified against PubMed/publisher/official pages.

Co-Authored-By: Claude <noreply@anthropic.com>
</commit_message>
<xml_diff>
--- a/UPLOAD_THIS_ESMO_OPEN_V3_10_HARDENED_UNDER20/ICI_IRAE_TOXICITY_PHENOTYPE_DECOMPOSITION_V3_10_ESMO_OPEN_HARDENED.docx
+++ b/UPLOAD_THIS_ESMO_OPEN_V3_10_HARDENED_UNDER20/ICI_IRAE_TOXICITY_PHENOTYPE_DECOMPOSITION_V3_10_ESMO_OPEN_HARDENED.docx
@@ -1134,19 +1134,19 @@
         </w:numPr>
       </w:pPr>
       <w:r>
-        <w:t xml:space="preserve">Janjigian YY, Shitara K, Moehler M, Garrido M, Salman P, Shen L, et al. First-line nivolumab plus chemotherapy versus chemotherapy alone for advanced gastric, gastro-oesophageal junction, and oesophageal adenocarcinoma (CheckMate 649): a randomised, open-label, phase 3 trial. The Lancet. 2021;398(10294):27-40. doi:10.1016/s0140-6736(21)00797-2</w:t>
-      </w:r>
-    </w:p>
-    <w:p>
-      <w:pPr>
-        <w:pStyle w:val="Compact"/>
-        <w:numPr>
-          <w:ilvl w:val="0"/>
-          <w:numId w:val="1001"/>
-        </w:numPr>
-      </w:pPr>
-      <w:r>
-        <w:t xml:space="preserve">Kuruvilla J, Ramchandren R, Santoro A, Paszkiewicz-Kozik E, Gasiorowski R, Johnson NA, et al. Pembrolizumab versus brentuximab vedotin in relapsed or refractory classical Hodgkin lymphoma (KEYNOTE-204): an interim analysis of a multicentre, randomised, open-label, phase 3 study. The Lancet Oncology. 2021;22(4):512-524. doi:10.1016/s1470-2045(21)00005-x</w:t>
+        <w:t>Janjigian YY, Shitara K, Moehler M, Garrido M, Salman P, Shen L, et al. First-line nivolumab plus chemotherapy versus chemotherapy alone for advanced gastric, gastro-oesophageal junction, and oesophageal adenocarcinoma (CheckMate 649): a randomised, open-label, phase 3 trial. The Lancet. 2021;398(10294):27-40. doi:10.1016/S0140-6736(21)00797-2</w:t>
+      </w:r>
+    </w:p>
+    <w:p>
+      <w:pPr>
+        <w:pStyle w:val="Compact"/>
+        <w:numPr>
+          <w:ilvl w:val="0"/>
+          <w:numId w:val="1001"/>
+        </w:numPr>
+      </w:pPr>
+      <w:r>
+        <w:t>Kuruvilla J, Ramchandren R, Santoro A, Paszkiewicz-Kozik E, Gasiorowski R, Johnson NA, et al. Pembrolizumab versus brentuximab vedotin in relapsed or refractory classical Hodgkin lymphoma (KEYNOTE-204): an interim analysis of a multicentre, randomised, open-label, phase 3 study. The Lancet Oncology. 2021;22(4):512-524. doi:10.1016/S1470-2045(21)00005-X</w:t>
       </w:r>
     </w:p>
     <w:p>
@@ -1170,7 +1170,7 @@
         </w:numPr>
       </w:pPr>
       <w:r>
-        <w:t xml:space="preserve">Paz-Ares L, Ciuleanu TE, Cobo M, Schenker M, Zurawski B, Menezes J, et al. First-line nivolumab plus ipilimumab combined with two cycles of chemotherapy in patients with non-small-cell lung cancer (CheckMate 9LA): an international, randomised, open-label, phase 3 trial. The Lancet Oncology. 2021;22(2):198-211. doi:10.1016/s1470-2045(20)30641-0</w:t>
+        <w:t>Paz-Ares L, Ciuleanu TE, Cobo M, Schenker M, Zurawski B, Menezes J, et al. First-line nivolumab plus ipilimumab combined with two cycles of chemotherapy in patients with non-small-cell lung cancer (CheckMate 9LA): an international, randomised, open-label, phase 3 trial. The Lancet Oncology. 2021;22(2):198-211. doi:10.1016/S1470-2045(20)30641-0</w:t>
       </w:r>
     </w:p>
     <w:p>
@@ -1194,19 +1194,19 @@
         </w:numPr>
       </w:pPr>
       <w:r>
-        <w:t xml:space="preserve">Sezer A, Kilickap S, Gumus M, Bondarenko I, Ozguroglu M, Gogishvili M, et al. Cemiplimab monotherapy for first-line treatment of advanced non-small-cell lung cancer with PD-L1 of at least 50%: a multicentre, open-label, global, phase 3, randomised, controlled trial. The Lancet. 2021;397(10274):592-604. doi:10.1016/s0140-6736(21)00228-2</w:t>
-      </w:r>
-    </w:p>
-    <w:p>
-      <w:pPr>
-        <w:pStyle w:val="Compact"/>
-        <w:numPr>
-          <w:ilvl w:val="0"/>
-          <w:numId w:val="1001"/>
-        </w:numPr>
-      </w:pPr>
-      <w:r>
-        <w:t xml:space="preserve">Sun JM, Shen L, Shah MA, Enzinger P, Adenis A, Doi T, et al. Pembrolizumab plus chemotherapy versus chemotherapy alone for first-line treatment of advanced oesophageal cancer (KEYNOTE-590): a randomised, placebo-controlled, phase 3 study. The Lancet. 2021;398(10302):759-771. doi:10.1016/s0140-6736(21)01234-4</w:t>
+        <w:t>Sezer A, Kilickap S, Gumus M, Bondarenko I, Ozguroglu M, Gogishvili M, et al. Cemiplimab monotherapy for first-line treatment of advanced non-small-cell lung cancer with PD-L1 of at least 50%: a multicentre, open-label, global, phase 3, randomised, controlled trial. The Lancet. 2021;397(10274):592-604. doi:10.1016/S0140-6736(21)00228-2</w:t>
+      </w:r>
+    </w:p>
+    <w:p>
+      <w:pPr>
+        <w:pStyle w:val="Compact"/>
+        <w:numPr>
+          <w:ilvl w:val="0"/>
+          <w:numId w:val="1001"/>
+        </w:numPr>
+      </w:pPr>
+      <w:r>
+        <w:t>Sun JM, Shen L, Shah MA, Enzinger P, Adenis A, Doi T, et al. Pembrolizumab plus chemotherapy versus chemotherapy alone for first-line treatment of advanced oesophageal cancer (KEYNOTE-590): a randomised, placebo-controlled, phase 3 study. The Lancet. 2021;398(10302):759-771. doi:10.1016/S0140-6736(21)01234-4</w:t>
       </w:r>
     </w:p>
     <w:p>
@@ -1326,7 +1326,7 @@
         </w:numPr>
       </w:pPr>
       <w:r>
-        <w:t xml:space="preserve">Park SH, Chang YH, Lee JL, Choueiri TK, Kimura G, Chung J, et al. Adjuvant Pembrolizumab Versus Placebo for Renal Cell Carcinoma in the East Asian Subgroup of the Phase 3 KEYNOTE-564 Study. Cancer Research and Treatment. 2026;58(2):613-621. doi:10.4143/crt.2025.365</w:t>
+        <w:t>Park SH, Chang YH, Lee JL, Choueiri TK, Kimura G, Chung J, et al. Adjuvant Pembrolizumab Versus Placebo for Renal Cell Carcinoma in the East Asian Subgroup of the Phase 3 KEYNOTE-564 Study. Cancer Research and Treatment. 2026;58(2):613-621. Epub 2025 Jun 26. doi:10.4143/crt.2025.365</w:t>
       </w:r>
     </w:p>
     <w:p>
@@ -1386,7 +1386,7 @@
         </w:numPr>
       </w:pPr>
       <w:r>
-        <w:t xml:space="preserve">U.S. Food and Drug Administration. openFDA Drug Event API. https://open.fda.gov/apis/drug/event/ Accessed 2026-06-28.</w:t>
+        <w:t>U.S. Food and Drug Administration. openFDA Drug Event API. Available at: https://open.fda.gov/apis/drug/event/. Accessed 28 June 2026.</w:t>
       </w:r>
     </w:p>
     <w:bookmarkEnd w:id="33"/>

</xml_diff>

<commit_message>
Fix title: replace colloquial question with formal declarative statement
'Cross-Tumor Immune Checkpoint Inhibitor Toxicity Comparisons
Are Not Supported by Current Evidence: A Four-System Phenotype
Decomposition Analysis'

Co-Authored-By: Claude <noreply@anthropic.com>
</commit_message>
<xml_diff>
--- a/UPLOAD_THIS_ESMO_OPEN_V3_10_HARDENED_UNDER20/ICI_IRAE_TOXICITY_PHENOTYPE_DECOMPOSITION_V3_10_ESMO_OPEN_HARDENED.docx
+++ b/UPLOAD_THIS_ESMO_OPEN_V3_10_HARDENED_UNDER20/ICI_IRAE_TOXICITY_PHENOTYPE_DECOMPOSITION_V3_10_ESMO_OPEN_HARDENED.docx
@@ -7,12 +7,12 @@
         <w:pStyle w:val="Heading1"/>
       </w:pPr>
       <w:r>
-        <w:t>Can ICI Toxicity Be Compared Across Tumor Types? Four Evidence Systems Say No.</w:t>
+        <w:t>Cross-Tumor Immune Checkpoint Inhibitor Toxicity Comparisons Are Not Supported by Current Evidence: A Four-System Phenotype Decomposition Analysis</w:t>
       </w:r>
     </w:p>
     <w:p>
       <w:r>
-        <w:t>Short title: Cross-tumor ICI toxicity comparisons require phenotype decomposition</w:t>
+        <w:t>Short title: Cross-tumor ICI toxicity comparisons are not supported by current evidence</w:t>
       </w:r>
     </w:p>
     <w:p>

</xml_diff>